<commit_message>
Restore client name in detection template
</commit_message>
<xml_diff>
--- a/firequote/quotes/templates_docs/detection_autocad.docx
+++ b/firequote/quotes/templates_docs/detection_autocad.docx
@@ -35,7 +35,6 @@
         <w:t xml:space="preserve"> </w:t>
       </w:r>
       <w:bookmarkStart w:id="3" w:name="_Hlk211509440"/>
-      <w:proofErr w:type="gramStart"/>
       <w:r>
         <w:rPr>
           <w:rFonts w:ascii="Cambria" w:hAnsi="Cambria"/>
@@ -57,9 +56,9 @@
           <w:szCs w:val="22"/>
           <w:lang w:val="en-US" w:eastAsia="en-US"/>
         </w:rPr>
-        <w:t>quote</w:t>
-      </w:r>
-      <w:proofErr w:type="gramEnd"/>
+        <w:t>quote_date</w:t>
+      </w:r>
+      <w:proofErr w:type="spellEnd"/>
       <w:r>
         <w:rPr>
           <w:rFonts w:ascii="Cambria" w:hAnsi="Cambria"/>
@@ -69,17 +68,149 @@
           <w:szCs w:val="22"/>
           <w:lang w:val="en-US" w:eastAsia="en-US"/>
         </w:rPr>
-        <w:t>_date</w:t>
+        <w:t xml:space="preserve"> }}</w:t>
+      </w:r>
+    </w:p>
+    <w:p>
+      <w:pPr>
+        <w:spacing w:after="0"/>
+        <w:rPr>
+          <w:rFonts w:asciiTheme="majorHAnsi" w:hAnsiTheme="majorHAnsi" w:cs="Arial"/>
+          <w:b/>
+          <w:lang w:val="en-US"/>
+        </w:rPr>
+      </w:pPr>
+    </w:p>
+    <w:p>
+      <w:pPr>
+        <w:spacing w:after="120"/>
+        <w:rPr>
+          <w:rFonts w:asciiTheme="majorHAnsi" w:hAnsiTheme="majorHAnsi" w:cs="Arial"/>
+          <w:b/>
+          <w:lang w:val="en-US"/>
+        </w:rPr>
+      </w:pPr>
+    </w:p>
+    <w:bookmarkEnd w:id="0"/>
+    <w:p>
+      <w:pPr>
+        <w:spacing w:after="0"/>
+        <w:rPr>
+          <w:rFonts w:asciiTheme="majorHAnsi" w:hAnsiTheme="majorHAnsi" w:cs="Arial"/>
+          <w:b/>
+          <w:lang w:val="en-US"/>
+        </w:rPr>
+      </w:pPr>
+      <w:r>
+        <w:rPr>
+          <w:rFonts w:asciiTheme="majorHAnsi" w:hAnsiTheme="majorHAnsi" w:cs="Arial"/>
+          <w:b/>
+          <w:lang w:val="en-US"/>
+        </w:rPr>
+        <w:t xml:space="preserve">{{ </w:t>
+      </w:r>
+      <w:proofErr w:type="spellStart"/>
+      <w:r>
+        <w:rPr>
+          <w:rFonts w:asciiTheme="majorHAnsi" w:hAnsiTheme="majorHAnsi" w:cs="Arial"/>
+          <w:b/>
+          <w:lang w:val="en-US"/>
+        </w:rPr>
+        <w:t>client_title</w:t>
       </w:r>
       <w:proofErr w:type="spellEnd"/>
       <w:r>
         <w:rPr>
-          <w:rFonts w:ascii="Cambria" w:hAnsi="Cambria"/>
-          <w:b/>
+          <w:rFonts w:asciiTheme="majorHAnsi" w:hAnsiTheme="majorHAnsi" w:cs="Arial"/>
+          <w:b/>
+          <w:lang w:val="en-US"/>
+        </w:rPr>
+        <w:t xml:space="preserve"> }}:                                                                                                                                           {{ </w:t>
+      </w:r>
+      <w:proofErr w:type="spellStart"/>
+      <w:r>
+        <w:rPr>
+          <w:rFonts w:asciiTheme="majorHAnsi" w:hAnsiTheme="majorHAnsi" w:cs="Arial"/>
+          <w:b/>
+          <w:lang w:val="en-US"/>
+        </w:rPr>
+        <w:t>quote_number</w:t>
+      </w:r>
+      <w:proofErr w:type="spellEnd"/>
+      <w:r>
+        <w:rPr>
+          <w:rFonts w:asciiTheme="majorHAnsi" w:hAnsiTheme="majorHAnsi" w:cs="Arial"/>
+          <w:b/>
+          <w:lang w:val="en-US"/>
+        </w:rPr>
+        <w:t xml:space="preserve"> }}</w:t>
+      </w:r>
+    </w:p>
+    <w:p>
+      <w:pPr>
+        <w:spacing w:after="0"/>
+        <w:rPr>
+          <w:rFonts w:asciiTheme="majorHAnsi" w:hAnsiTheme="majorHAnsi" w:cs="Arial"/>
+          <w:u w:val="single"/>
+          <w:lang w:val="en-US"/>
+        </w:rPr>
+      </w:pPr>
+      <w:r>
+        <w:rPr>
+          <w:rFonts w:asciiTheme="majorHAnsi" w:hAnsiTheme="majorHAnsi" w:cs="Arial"/>
+          <w:lang w:val="en-US"/>
+        </w:rPr>
+        <w:t xml:space="preserve">{{ </w:t>
+      </w:r>
+      <w:proofErr w:type="spellStart"/>
+      <w:r>
+        <w:rPr>
+          <w:rFonts w:asciiTheme="majorHAnsi" w:hAnsiTheme="majorHAnsi" w:cs="Arial"/>
+          <w:lang w:val="en-US"/>
+        </w:rPr>
+        <w:t>client_name</w:t>
+      </w:r>
+      <w:proofErr w:type="spellEnd"/>
+      <w:r>
+        <w:rPr>
+          <w:rFonts w:asciiTheme="majorHAnsi" w:hAnsiTheme="majorHAnsi" w:cs="Arial"/>
+          <w:lang w:val="en-US"/>
+        </w:rPr>
+        <w:t xml:space="preserve"> }}</w:t>
+      </w:r>
+    </w:p>
+    <w:p>
+      <w:pPr>
+        <w:spacing w:after="0"/>
+        <w:rPr>
+          <w:rFonts w:asciiTheme="majorHAnsi" w:hAnsiTheme="majorHAnsi" w:cs="Arial"/>
           <w:bCs/>
-          <w:sz w:val="22"/>
-          <w:szCs w:val="22"/>
-          <w:lang w:val="en-US" w:eastAsia="en-US"/>
+          <w:lang w:val="en-US"/>
+        </w:rPr>
+      </w:pPr>
+      <w:r>
+        <w:rPr>
+          <w:rFonts w:asciiTheme="majorHAnsi" w:hAnsiTheme="majorHAnsi" w:cs="Arial"/>
+          <w:bCs/>
+          <w:lang w:val="en-US"/>
+        </w:rPr>
+        <w:t xml:space="preserve">{{ </w:t>
+      </w:r>
+      <w:proofErr w:type="spellStart"/>
+      <w:r>
+        <w:rPr>
+          <w:rFonts w:asciiTheme="majorHAnsi" w:hAnsiTheme="majorHAnsi" w:cs="Arial"/>
+          <w:bCs/>
+          <w:lang w:val="en-US"/>
+        </w:rPr>
+        <w:t>client_position</w:t>
+      </w:r>
+      <w:proofErr w:type="spellEnd"/>
+      <w:r>
+        <w:rPr>
+          <w:rFonts w:asciiTheme="majorHAnsi" w:hAnsiTheme="majorHAnsi" w:cs="Arial"/>
+          <w:bCs/>
+          <w:lang w:val="en-US"/>
         </w:rPr>
         <w:t xml:space="preserve"> }}</w:t>
       </w:r>
@@ -93,79 +224,47 @@
           <w:lang w:val="en-US"/>
         </w:rPr>
       </w:pPr>
-    </w:p>
-    <w:p>
-      <w:pPr>
-        <w:spacing w:after="120"/>
-        <w:rPr>
-          <w:rFonts w:asciiTheme="majorHAnsi" w:hAnsiTheme="majorHAnsi" w:cs="Arial"/>
-          <w:b/>
-          <w:lang w:val="en-US"/>
-        </w:rPr>
-      </w:pPr>
+      <w:r>
+        <w:rPr>
+          <w:rFonts w:asciiTheme="majorHAnsi" w:hAnsiTheme="majorHAnsi" w:cs="Arial"/>
+          <w:b/>
+          <w:lang w:val="en-US"/>
+        </w:rPr>
+        <w:t xml:space="preserve">{{ </w:t>
+      </w:r>
+      <w:proofErr w:type="spellStart"/>
+      <w:r>
+        <w:rPr>
+          <w:rFonts w:asciiTheme="majorHAnsi" w:hAnsiTheme="majorHAnsi" w:cs="Arial"/>
+          <w:b/>
+          <w:lang w:val="en-US"/>
+        </w:rPr>
+        <w:t>client_company</w:t>
+      </w:r>
+      <w:proofErr w:type="spellEnd"/>
+      <w:r>
+        <w:rPr>
+          <w:rFonts w:asciiTheme="majorHAnsi" w:hAnsiTheme="majorHAnsi" w:cs="Arial"/>
+          <w:b/>
+          <w:lang w:val="en-US"/>
+        </w:rPr>
+        <w:t xml:space="preserve"> }}</w:t>
+      </w:r>
     </w:p>
     <w:p>
       <w:pPr>
         <w:spacing w:after="0"/>
         <w:rPr>
           <w:rFonts w:asciiTheme="majorHAnsi" w:hAnsiTheme="majorHAnsi" w:cs="Arial"/>
-          <w:b/>
-          <w:lang w:val="en-US"/>
-        </w:rPr>
-      </w:pPr>
-      <w:proofErr w:type="gramStart"/>
-      <w:r>
-        <w:rPr>
-          <w:rFonts w:asciiTheme="majorHAnsi" w:hAnsiTheme="majorHAnsi" w:cs="Arial"/>
-          <w:b/>
-          <w:lang w:val="en-US"/>
-        </w:rPr>
-        <w:t xml:space="preserve">{{ </w:t>
-      </w:r>
-      <w:proofErr w:type="spellStart"/>
-      <w:r>
-        <w:rPr>
-          <w:rFonts w:asciiTheme="majorHAnsi" w:hAnsiTheme="majorHAnsi" w:cs="Arial"/>
-          <w:b/>
-          <w:lang w:val="en-US"/>
-        </w:rPr>
-        <w:t>client</w:t>
-      </w:r>
-      <w:proofErr w:type="gramEnd"/>
-      <w:r>
-        <w:rPr>
-          <w:rFonts w:asciiTheme="majorHAnsi" w:hAnsiTheme="majorHAnsi" w:cs="Arial"/>
-          <w:b/>
-          <w:lang w:val="en-US"/>
-        </w:rPr>
-        <w:t>_title</w:t>
-      </w:r>
-      <w:proofErr w:type="spellEnd"/>
-      <w:r>
-        <w:rPr>
-          <w:rFonts w:asciiTheme="majorHAnsi" w:hAnsiTheme="majorHAnsi" w:cs="Arial"/>
-          <w:b/>
-          <w:lang w:val="en-US"/>
-        </w:rPr>
-        <w:t xml:space="preserve"> }}:                                                                                                                                           {{ </w:t>
-      </w:r>
-      <w:proofErr w:type="spellStart"/>
-      <w:r>
-        <w:rPr>
-          <w:rFonts w:asciiTheme="majorHAnsi" w:hAnsiTheme="majorHAnsi" w:cs="Arial"/>
-          <w:b/>
-          <w:lang w:val="en-US"/>
-        </w:rPr>
-        <w:t>quote_number</w:t>
-      </w:r>
-      <w:proofErr w:type="spellEnd"/>
-      <w:r>
-        <w:rPr>
-          <w:rFonts w:asciiTheme="majorHAnsi" w:hAnsiTheme="majorHAnsi" w:cs="Arial"/>
-          <w:b/>
-          <w:lang w:val="en-US"/>
-        </w:rPr>
-        <w:t xml:space="preserve"> }}</w:t>
+          <w:lang w:val="en-US"/>
+        </w:rPr>
+      </w:pPr>
+      <w:r>
+        <w:rPr>
+          <w:rFonts w:asciiTheme="majorHAnsi" w:hAnsiTheme="majorHAnsi" w:cs="Arial"/>
+          <w:lang w:val="en-US"/>
+        </w:rPr>
+        <w:t>{{ client_city }}</w:t>
       </w:r>
     </w:p>
     <w:p>
@@ -173,151 +272,17 @@
         <w:spacing w:after="0"/>
         <w:rPr>
           <w:rFonts w:asciiTheme="majorHAnsi" w:hAnsiTheme="majorHAnsi" w:cs="Arial"/>
-          <w:bCs/>
-          <w:lang w:val="en-US"/>
-        </w:rPr>
-      </w:pPr>
-      <w:proofErr w:type="gramStart"/>
-      <w:r>
-        <w:rPr>
-          <w:rFonts w:asciiTheme="majorHAnsi" w:hAnsiTheme="majorHAnsi" w:cs="Arial"/>
-          <w:bCs/>
-          <w:lang w:val="en-US"/>
-        </w:rPr>
-        <w:t xml:space="preserve">{{ </w:t>
-      </w:r>
-      <w:proofErr w:type="spellStart"/>
-      <w:r>
-        <w:rPr>
-          <w:rFonts w:asciiTheme="majorHAnsi" w:hAnsiTheme="majorHAnsi" w:cs="Arial"/>
-          <w:bCs/>
-          <w:lang w:val="en-US"/>
-        </w:rPr>
-        <w:t>client</w:t>
-      </w:r>
-      <w:proofErr w:type="gramEnd"/>
-      <w:r>
-        <w:rPr>
-          <w:rFonts w:asciiTheme="majorHAnsi" w:hAnsiTheme="majorHAnsi" w:cs="Arial"/>
-          <w:bCs/>
-          <w:lang w:val="en-US"/>
-        </w:rPr>
-        <w:t>_position</w:t>
-      </w:r>
-      <w:proofErr w:type="spellEnd"/>
-      <w:r>
-        <w:rPr>
-          <w:rFonts w:asciiTheme="majorHAnsi" w:hAnsiTheme="majorHAnsi" w:cs="Arial"/>
-          <w:bCs/>
-          <w:lang w:val="en-US"/>
-        </w:rPr>
-        <w:t xml:space="preserve"> }}</w:t>
-      </w:r>
+          <w:b/>
+          <w:lang w:val="en-US"/>
+        </w:rPr>
+      </w:pPr>
     </w:p>
     <w:p>
       <w:pPr>
         <w:spacing w:after="0"/>
         <w:rPr>
           <w:rFonts w:asciiTheme="majorHAnsi" w:hAnsiTheme="majorHAnsi" w:cs="Arial"/>
-          <w:b/>
-          <w:lang w:val="es-MX"/>
-        </w:rPr>
-      </w:pPr>
-      <w:proofErr w:type="gramStart"/>
-      <w:r>
-        <w:rPr>
-          <w:rFonts w:asciiTheme="majorHAnsi" w:hAnsiTheme="majorHAnsi" w:cs="Arial"/>
-          <w:b/>
-          <w:lang w:val="es-MX"/>
-        </w:rPr>
-        <w:t xml:space="preserve">{{ </w:t>
-      </w:r>
-      <w:proofErr w:type="spellStart"/>
-      <w:r>
-        <w:rPr>
-          <w:rFonts w:asciiTheme="majorHAnsi" w:hAnsiTheme="majorHAnsi" w:cs="Arial"/>
-          <w:b/>
-          <w:lang w:val="es-MX"/>
-        </w:rPr>
-        <w:t>client</w:t>
-      </w:r>
-      <w:proofErr w:type="gramEnd"/>
-      <w:r>
-        <w:rPr>
-          <w:rFonts w:asciiTheme="majorHAnsi" w:hAnsiTheme="majorHAnsi" w:cs="Arial"/>
-          <w:b/>
-          <w:lang w:val="es-MX"/>
-        </w:rPr>
-        <w:t>_company</w:t>
-      </w:r>
-      <w:proofErr w:type="spellEnd"/>
-      <w:r>
-        <w:rPr>
-          <w:rFonts w:asciiTheme="majorHAnsi" w:hAnsiTheme="majorHAnsi" w:cs="Arial"/>
-          <w:b/>
-          <w:lang w:val="es-MX"/>
-        </w:rPr>
-        <w:t xml:space="preserve"> }}</w:t>
-      </w:r>
-    </w:p>
-    <w:p>
-      <w:pPr>
-        <w:spacing w:after="0"/>
-        <w:rPr>
-          <w:rFonts w:asciiTheme="majorHAnsi" w:hAnsiTheme="majorHAnsi" w:cs="Arial"/>
-          <w:lang w:val="es-MX"/>
-        </w:rPr>
-      </w:pPr>
-      <w:proofErr w:type="gramStart"/>
-      <w:r>
-        <w:rPr>
-          <w:rFonts w:asciiTheme="majorHAnsi" w:hAnsiTheme="majorHAnsi" w:cs="Arial"/>
-          <w:lang w:val="es-MX"/>
-        </w:rPr>
-        <w:t xml:space="preserve">{{ </w:t>
-      </w:r>
-      <w:proofErr w:type="spellStart"/>
-      <w:r>
-        <w:rPr>
-          <w:rFonts w:asciiTheme="majorHAnsi" w:hAnsiTheme="majorHAnsi" w:cs="Arial"/>
-          <w:lang w:val="es-MX"/>
-        </w:rPr>
-        <w:t>client</w:t>
-      </w:r>
-      <w:proofErr w:type="gramEnd"/>
-      <w:r>
-        <w:rPr>
-          <w:rFonts w:asciiTheme="majorHAnsi" w:hAnsiTheme="majorHAnsi" w:cs="Arial"/>
-          <w:lang w:val="es-MX"/>
-        </w:rPr>
-        <w:t>_city</w:t>
-      </w:r>
-      <w:proofErr w:type="spellEnd"/>
-      <w:r>
-        <w:rPr>
-          <w:rFonts w:asciiTheme="majorHAnsi" w:hAnsiTheme="majorHAnsi" w:cs="Arial"/>
-          <w:lang w:val="es-MX"/>
-        </w:rPr>
-        <w:t xml:space="preserve"> }}</w:t>
-      </w:r>
-    </w:p>
-    <w:bookmarkEnd w:id="0"/>
-    <w:p>
-      <w:pPr>
-        <w:spacing w:after="0"/>
-        <w:rPr>
-          <w:rFonts w:asciiTheme="majorHAnsi" w:hAnsiTheme="majorHAnsi" w:cs="Arial"/>
-          <w:b/>
-          <w:lang w:val="es-MX"/>
-        </w:rPr>
-      </w:pPr>
-    </w:p>
-    <w:p>
-      <w:pPr>
-        <w:spacing w:after="0"/>
-        <w:rPr>
-          <w:rFonts w:asciiTheme="majorHAnsi" w:hAnsiTheme="majorHAnsi" w:cs="Arial"/>
-          <w:lang w:val="es-MX"/>
+          <w:lang w:val="en-US"/>
         </w:rPr>
       </w:pPr>
     </w:p>
@@ -360,7 +325,6 @@
         </w:rPr>
         <w:t xml:space="preserve"> PARA EL PROYECTO </w:t>
       </w:r>
-      <w:proofErr w:type="gramStart"/>
       <w:r>
         <w:rPr>
           <w:rFonts w:asciiTheme="majorHAnsi" w:hAnsiTheme="majorHAnsi" w:cs="Arial"/>
@@ -374,15 +338,7 @@
           <w:rFonts w:asciiTheme="majorHAnsi" w:hAnsiTheme="majorHAnsi" w:cs="Arial"/>
           <w:b/>
         </w:rPr>
-        <w:t>project</w:t>
-      </w:r>
-      <w:proofErr w:type="gramEnd"/>
-      <w:r>
-        <w:rPr>
-          <w:rFonts w:asciiTheme="majorHAnsi" w:hAnsiTheme="majorHAnsi" w:cs="Arial"/>
-          <w:b/>
-        </w:rPr>
-        <w:t>_nam</w:t>
+        <w:t>project_nam</w:t>
       </w:r>
       <w:r>
         <w:rPr>
@@ -461,7 +417,6 @@
         </w:rPr>
         <w:t xml:space="preserve"> “</w:t>
       </w:r>
-      <w:proofErr w:type="gramStart"/>
       <w:r>
         <w:rPr>
           <w:rFonts w:asciiTheme="majorHAnsi" w:hAnsiTheme="majorHAnsi" w:cs="Arial"/>
@@ -475,15 +430,7 @@
           <w:rFonts w:asciiTheme="majorHAnsi" w:hAnsiTheme="majorHAnsi" w:cs="Arial"/>
           <w:color w:val="222222"/>
         </w:rPr>
-        <w:t>project</w:t>
-      </w:r>
-      <w:proofErr w:type="gramEnd"/>
-      <w:r>
-        <w:rPr>
-          <w:rFonts w:asciiTheme="majorHAnsi" w:hAnsiTheme="majorHAnsi" w:cs="Arial"/>
-          <w:color w:val="222222"/>
-        </w:rPr>
-        <w:t>_name</w:t>
+        <w:t>project_name</w:t>
       </w:r>
       <w:proofErr w:type="spellEnd"/>
       <w:r>
@@ -838,9 +785,9 @@
           <w:kern w:val="1"/>
           <w:lang w:val="es-MX"/>
         </w:rPr>
-        <w:t>reference_</w:t>
-      </w:r>
-      <w:proofErr w:type="gramStart"/>
+        <w:t>reference_norms</w:t>
+      </w:r>
+      <w:proofErr w:type="spellEnd"/>
       <w:r>
         <w:rPr>
           <w:rFonts w:asciiTheme="majorHAnsi" w:eastAsia="Arial Unicode MS" w:hAnsiTheme="majorHAnsi" w:cs="Arial"/>
@@ -848,27 +795,7 @@
           <w:kern w:val="1"/>
           <w:lang w:val="es-MX"/>
         </w:rPr>
-        <w:t>norms</w:t>
-      </w:r>
-      <w:proofErr w:type="spellEnd"/>
-      <w:r>
-        <w:rPr>
-          <w:rFonts w:asciiTheme="majorHAnsi" w:eastAsia="Arial Unicode MS" w:hAnsiTheme="majorHAnsi" w:cs="Arial"/>
-          <w:i/>
-          <w:kern w:val="1"/>
-          <w:lang w:val="es-MX"/>
-        </w:rPr>
-        <w:t xml:space="preserve"> }</w:t>
-      </w:r>
-      <w:proofErr w:type="gramEnd"/>
-      <w:r>
-        <w:rPr>
-          <w:rFonts w:asciiTheme="majorHAnsi" w:eastAsia="Arial Unicode MS" w:hAnsiTheme="majorHAnsi" w:cs="Arial"/>
-          <w:i/>
-          <w:kern w:val="1"/>
-          <w:lang w:val="es-MX"/>
-        </w:rPr>
-        <w:t>}</w:t>
+        <w:t xml:space="preserve"> }}</w:t>
       </w:r>
     </w:p>
     <w:p>
@@ -1148,7 +1075,6 @@
           <w:sz w:val="22"/>
           <w:szCs w:val="22"/>
         </w:rPr>
-        <w:lastRenderedPageBreak/>
         <w:t xml:space="preserve">Luego se </w:t>
       </w:r>
       <w:r>
@@ -1403,7 +1329,6 @@
           <w:lang w:val="en-US"/>
         </w:rPr>
       </w:pPr>
-      <w:proofErr w:type="gramStart"/>
       <w:r>
         <w:rPr>
           <w:rFonts w:asciiTheme="majorHAnsi" w:hAnsiTheme="majorHAnsi" w:cs="Arial"/>
@@ -1423,18 +1348,7 @@
           <w:szCs w:val="22"/>
           <w:lang w:val="en-US"/>
         </w:rPr>
-        <w:t>client</w:t>
-      </w:r>
-      <w:proofErr w:type="gramEnd"/>
-      <w:r>
-        <w:rPr>
-          <w:rFonts w:asciiTheme="majorHAnsi" w:hAnsiTheme="majorHAnsi" w:cs="Arial"/>
-          <w:color w:val="222222"/>
-          <w:sz w:val="22"/>
-          <w:szCs w:val="22"/>
-          <w:lang w:val="en-US"/>
-        </w:rPr>
-        <w:t>_requirements</w:t>
+        <w:t>client_requirements</w:t>
       </w:r>
       <w:proofErr w:type="spellEnd"/>
       <w:r>
@@ -1933,7 +1847,6 @@
           <w:lang w:val="en-US"/>
         </w:rPr>
       </w:pPr>
-      <w:proofErr w:type="gramStart"/>
       <w:r>
         <w:rPr>
           <w:rFonts w:asciiTheme="majorHAnsi" w:hAnsiTheme="majorHAnsi" w:cstheme="minorHAnsi"/>
@@ -1953,18 +1866,7 @@
           <w:szCs w:val="22"/>
           <w:lang w:val="en-US"/>
         </w:rPr>
-        <w:t>items</w:t>
-      </w:r>
-      <w:proofErr w:type="gramEnd"/>
-      <w:r>
-        <w:rPr>
-          <w:rFonts w:asciiTheme="majorHAnsi" w:hAnsiTheme="majorHAnsi" w:cstheme="minorHAnsi"/>
-          <w:color w:val="222222"/>
-          <w:sz w:val="22"/>
-          <w:szCs w:val="22"/>
-          <w:lang w:val="en-US"/>
-        </w:rPr>
-        <w:t>_detection</w:t>
+        <w:t>items_detection</w:t>
       </w:r>
       <w:proofErr w:type="spellEnd"/>
       <w:r>
@@ -2326,6 +2228,7 @@
           <w:sz w:val="22"/>
           <w:szCs w:val="22"/>
         </w:rPr>
+        <w:lastRenderedPageBreak/>
         <w:t>Valor de la oferta.</w:t>
       </w:r>
     </w:p>
@@ -2361,7 +2264,6 @@
         </w:rPr>
       </w:pPr>
       <w:bookmarkStart w:id="5" w:name="_Hlk211507778"/>
-      <w:proofErr w:type="gramStart"/>
       <w:r>
         <w:rPr>
           <w:rFonts w:asciiTheme="majorHAnsi" w:hAnsiTheme="majorHAnsi" w:cs="Arial"/>
@@ -2381,18 +2283,7 @@
           <w:sz w:val="22"/>
           <w:szCs w:val="22"/>
         </w:rPr>
-        <w:t>total</w:t>
-      </w:r>
-      <w:proofErr w:type="gramEnd"/>
-      <w:r>
-        <w:rPr>
-          <w:rFonts w:asciiTheme="majorHAnsi" w:hAnsiTheme="majorHAnsi" w:cs="Arial"/>
-          <w:bCs/>
-          <w:color w:val="222222"/>
-          <w:sz w:val="22"/>
-          <w:szCs w:val="22"/>
-        </w:rPr>
-        <w:t>_value_text</w:t>
+        <w:t>total_value_text</w:t>
       </w:r>
       <w:proofErr w:type="spellEnd"/>
       <w:r>
@@ -2437,7 +2328,6 @@
           <w:szCs w:val="22"/>
         </w:rPr>
       </w:pPr>
-      <w:proofErr w:type="gramStart"/>
       <w:r>
         <w:rPr>
           <w:rFonts w:asciiTheme="majorHAnsi" w:hAnsiTheme="majorHAnsi" w:cs="Arial"/>
@@ -2447,19 +2337,7 @@
           <w:sz w:val="22"/>
           <w:szCs w:val="22"/>
         </w:rPr>
-        <w:t>{{ note</w:t>
-      </w:r>
-      <w:proofErr w:type="gramEnd"/>
-      <w:r>
-        <w:rPr>
-          <w:rFonts w:asciiTheme="majorHAnsi" w:hAnsiTheme="majorHAnsi" w:cs="Arial"/>
-          <w:b/>
-          <w:bCs/>
-          <w:color w:val="222222"/>
-          <w:sz w:val="22"/>
-          <w:szCs w:val="22"/>
-        </w:rPr>
-        <w:t>_title_1 }}</w:t>
+        <w:t>{{ note_title_1 }}</w:t>
       </w:r>
       <w:r>
         <w:rPr>
@@ -2608,7 +2486,6 @@
         </w:rPr>
       </w:pPr>
       <w:bookmarkStart w:id="7" w:name="_Hlk211508511"/>
-      <w:proofErr w:type="gramStart"/>
       <w:r>
         <w:rPr>
           <w:rFonts w:asciiTheme="majorHAnsi" w:hAnsiTheme="majorHAnsi" w:cs="Arial"/>
@@ -2619,20 +2496,7 @@
           <w:szCs w:val="22"/>
           <w:lang w:val="en-US"/>
         </w:rPr>
-        <w:t>{{ note</w:t>
-      </w:r>
-      <w:proofErr w:type="gramEnd"/>
-      <w:r>
-        <w:rPr>
-          <w:rFonts w:asciiTheme="majorHAnsi" w:hAnsiTheme="majorHAnsi" w:cs="Arial"/>
-          <w:b/>
-          <w:bCs/>
-          <w:color w:val="222222"/>
-          <w:sz w:val="22"/>
-          <w:szCs w:val="22"/>
-          <w:lang w:val="en-US"/>
-        </w:rPr>
-        <w:t>_title_2 }}</w:t>
+        <w:t>{{ note_title_2 }}</w:t>
       </w:r>
       <w:r>
         <w:rPr>
@@ -2697,7 +2561,6 @@
           <w:lang w:val="en-US"/>
         </w:rPr>
       </w:pPr>
-      <w:proofErr w:type="gramStart"/>
       <w:r>
         <w:rPr>
           <w:rFonts w:asciiTheme="majorHAnsi" w:hAnsiTheme="majorHAnsi" w:cs="Arial"/>
@@ -2708,20 +2571,7 @@
           <w:szCs w:val="22"/>
           <w:lang w:val="en-US"/>
         </w:rPr>
-        <w:t>{{ note</w:t>
-      </w:r>
-      <w:proofErr w:type="gramEnd"/>
-      <w:r>
-        <w:rPr>
-          <w:rFonts w:asciiTheme="majorHAnsi" w:hAnsiTheme="majorHAnsi" w:cs="Arial"/>
-          <w:b/>
-          <w:bCs/>
-          <w:color w:val="222222"/>
-          <w:sz w:val="22"/>
-          <w:szCs w:val="22"/>
-          <w:lang w:val="en-US"/>
-        </w:rPr>
-        <w:t>_title_3 }}</w:t>
+        <w:t>{{ note_title_3 }}</w:t>
       </w:r>
       <w:r>
         <w:rPr>
@@ -2786,7 +2636,6 @@
           <w:lang w:val="en-US"/>
         </w:rPr>
       </w:pPr>
-      <w:proofErr w:type="gramStart"/>
       <w:r>
         <w:rPr>
           <w:rFonts w:asciiTheme="majorHAnsi" w:hAnsiTheme="majorHAnsi" w:cs="Arial"/>
@@ -2797,20 +2646,7 @@
           <w:szCs w:val="22"/>
           <w:lang w:val="en-US"/>
         </w:rPr>
-        <w:t>{{ note</w:t>
-      </w:r>
-      <w:proofErr w:type="gramEnd"/>
-      <w:r>
-        <w:rPr>
-          <w:rFonts w:asciiTheme="majorHAnsi" w:hAnsiTheme="majorHAnsi" w:cs="Arial"/>
-          <w:b/>
-          <w:bCs/>
-          <w:color w:val="222222"/>
-          <w:sz w:val="22"/>
-          <w:szCs w:val="22"/>
-          <w:lang w:val="en-US"/>
-        </w:rPr>
-        <w:t>_title_4 }}</w:t>
+        <w:t>{{ note_title_4 }}</w:t>
       </w:r>
       <w:r>
         <w:rPr>
@@ -2875,7 +2711,6 @@
           <w:lang w:val="en-US"/>
         </w:rPr>
       </w:pPr>
-      <w:proofErr w:type="gramStart"/>
       <w:r>
         <w:rPr>
           <w:rFonts w:asciiTheme="majorHAnsi" w:hAnsiTheme="majorHAnsi" w:cs="Arial"/>
@@ -2886,20 +2721,7 @@
           <w:szCs w:val="22"/>
           <w:lang w:val="en-US"/>
         </w:rPr>
-        <w:t>{{ note</w:t>
-      </w:r>
-      <w:proofErr w:type="gramEnd"/>
-      <w:r>
-        <w:rPr>
-          <w:rFonts w:asciiTheme="majorHAnsi" w:hAnsiTheme="majorHAnsi" w:cs="Arial"/>
-          <w:b/>
-          <w:bCs/>
-          <w:color w:val="222222"/>
-          <w:sz w:val="22"/>
-          <w:szCs w:val="22"/>
-          <w:lang w:val="en-US"/>
-        </w:rPr>
-        <w:t>_title_5 }}</w:t>
+        <w:t>{{ note_title_5 }}</w:t>
       </w:r>
       <w:r>
         <w:rPr>
@@ -2964,7 +2786,6 @@
           <w:lang w:val="en-US"/>
         </w:rPr>
       </w:pPr>
-      <w:proofErr w:type="gramStart"/>
       <w:r>
         <w:rPr>
           <w:rFonts w:asciiTheme="majorHAnsi" w:hAnsiTheme="majorHAnsi" w:cs="Arial"/>
@@ -2975,20 +2796,7 @@
           <w:szCs w:val="22"/>
           <w:lang w:val="en-US"/>
         </w:rPr>
-        <w:t>{{ note</w:t>
-      </w:r>
-      <w:proofErr w:type="gramEnd"/>
-      <w:r>
-        <w:rPr>
-          <w:rFonts w:asciiTheme="majorHAnsi" w:hAnsiTheme="majorHAnsi" w:cs="Arial"/>
-          <w:b/>
-          <w:bCs/>
-          <w:color w:val="222222"/>
-          <w:sz w:val="22"/>
-          <w:szCs w:val="22"/>
-          <w:lang w:val="en-US"/>
-        </w:rPr>
-        <w:t>_title_6 }}</w:t>
+        <w:t>{{ note_title_6 }}</w:t>
       </w:r>
       <w:r>
         <w:rPr>
@@ -3053,7 +2861,6 @@
           <w:lang w:val="en-US"/>
         </w:rPr>
       </w:pPr>
-      <w:proofErr w:type="gramStart"/>
       <w:r>
         <w:rPr>
           <w:rFonts w:asciiTheme="majorHAnsi" w:hAnsiTheme="majorHAnsi" w:cs="Arial"/>
@@ -3064,20 +2871,7 @@
           <w:szCs w:val="22"/>
           <w:lang w:val="en-US"/>
         </w:rPr>
-        <w:t>{{ note</w:t>
-      </w:r>
-      <w:proofErr w:type="gramEnd"/>
-      <w:r>
-        <w:rPr>
-          <w:rFonts w:asciiTheme="majorHAnsi" w:hAnsiTheme="majorHAnsi" w:cs="Arial"/>
-          <w:b/>
-          <w:bCs/>
-          <w:color w:val="222222"/>
-          <w:sz w:val="22"/>
-          <w:szCs w:val="22"/>
-          <w:lang w:val="en-US"/>
-        </w:rPr>
-        <w:t>_title_7 }}</w:t>
+        <w:t>{{ note_title_7 }}</w:t>
       </w:r>
       <w:r>
         <w:rPr>
@@ -3142,7 +2936,6 @@
           <w:lang w:val="en-US"/>
         </w:rPr>
       </w:pPr>
-      <w:proofErr w:type="gramStart"/>
       <w:r>
         <w:rPr>
           <w:rFonts w:asciiTheme="majorHAnsi" w:hAnsiTheme="majorHAnsi" w:cs="Arial"/>
@@ -3153,20 +2946,7 @@
           <w:szCs w:val="22"/>
           <w:lang w:val="en-US"/>
         </w:rPr>
-        <w:t>{{ note</w:t>
-      </w:r>
-      <w:proofErr w:type="gramEnd"/>
-      <w:r>
-        <w:rPr>
-          <w:rFonts w:asciiTheme="majorHAnsi" w:hAnsiTheme="majorHAnsi" w:cs="Arial"/>
-          <w:b/>
-          <w:bCs/>
-          <w:color w:val="222222"/>
-          <w:sz w:val="22"/>
-          <w:szCs w:val="22"/>
-          <w:lang w:val="en-US"/>
-        </w:rPr>
-        <w:t>_title_8 }}</w:t>
+        <w:t>{{ note_title_8 }}</w:t>
       </w:r>
       <w:r>
         <w:rPr>
@@ -3231,7 +3011,6 @@
           <w:lang w:val="en-US"/>
         </w:rPr>
       </w:pPr>
-      <w:proofErr w:type="gramStart"/>
       <w:r>
         <w:rPr>
           <w:rFonts w:asciiTheme="majorHAnsi" w:hAnsiTheme="majorHAnsi" w:cs="Arial"/>
@@ -3242,20 +3021,7 @@
           <w:szCs w:val="22"/>
           <w:lang w:val="en-US"/>
         </w:rPr>
-        <w:t>{{ note</w:t>
-      </w:r>
-      <w:proofErr w:type="gramEnd"/>
-      <w:r>
-        <w:rPr>
-          <w:rFonts w:asciiTheme="majorHAnsi" w:hAnsiTheme="majorHAnsi" w:cs="Arial"/>
-          <w:b/>
-          <w:bCs/>
-          <w:color w:val="222222"/>
-          <w:sz w:val="22"/>
-          <w:szCs w:val="22"/>
-          <w:lang w:val="en-US"/>
-        </w:rPr>
-        <w:t>_title_9 }}</w:t>
+        <w:t>{{ note_title_9 }}</w:t>
       </w:r>
       <w:r>
         <w:rPr>
@@ -3320,7 +3086,6 @@
           <w:lang w:val="en-US"/>
         </w:rPr>
       </w:pPr>
-      <w:proofErr w:type="gramStart"/>
       <w:r>
         <w:rPr>
           <w:rFonts w:asciiTheme="majorHAnsi" w:hAnsiTheme="majorHAnsi" w:cs="Arial"/>
@@ -3331,20 +3096,7 @@
           <w:szCs w:val="22"/>
           <w:lang w:val="en-US"/>
         </w:rPr>
-        <w:t>{{ note</w:t>
-      </w:r>
-      <w:proofErr w:type="gramEnd"/>
-      <w:r>
-        <w:rPr>
-          <w:rFonts w:asciiTheme="majorHAnsi" w:hAnsiTheme="majorHAnsi" w:cs="Arial"/>
-          <w:b/>
-          <w:bCs/>
-          <w:color w:val="222222"/>
-          <w:sz w:val="22"/>
-          <w:szCs w:val="22"/>
-          <w:lang w:val="en-US"/>
-        </w:rPr>
-        <w:t>_title_10 }}</w:t>
+        <w:t>{{ note_title_10 }}</w:t>
       </w:r>
       <w:r>
         <w:rPr>
@@ -3409,7 +3161,6 @@
           <w:lang w:val="en-US"/>
         </w:rPr>
       </w:pPr>
-      <w:proofErr w:type="gramStart"/>
       <w:r>
         <w:rPr>
           <w:rFonts w:asciiTheme="majorHAnsi" w:hAnsiTheme="majorHAnsi" w:cs="Arial"/>
@@ -3420,20 +3171,7 @@
           <w:szCs w:val="22"/>
           <w:lang w:val="en-US"/>
         </w:rPr>
-        <w:t>{{ note</w:t>
-      </w:r>
-      <w:proofErr w:type="gramEnd"/>
-      <w:r>
-        <w:rPr>
-          <w:rFonts w:asciiTheme="majorHAnsi" w:hAnsiTheme="majorHAnsi" w:cs="Arial"/>
-          <w:b/>
-          <w:bCs/>
-          <w:color w:val="222222"/>
-          <w:sz w:val="22"/>
-          <w:szCs w:val="22"/>
-          <w:lang w:val="en-US"/>
-        </w:rPr>
-        <w:t>_title_11 }}</w:t>
+        <w:t>{{ note_title_11 }}</w:t>
       </w:r>
       <w:r>
         <w:rPr>
@@ -3589,7 +3327,6 @@
           <w:lang w:val="en-US"/>
         </w:rPr>
       </w:pPr>
-      <w:proofErr w:type="gramStart"/>
       <w:r>
         <w:rPr>
           <w:rFonts w:asciiTheme="majorHAnsi" w:hAnsiTheme="majorHAnsi" w:cs="Arial"/>
@@ -3609,18 +3346,7 @@
           <w:szCs w:val="22"/>
           <w:lang w:val="en-US"/>
         </w:rPr>
-        <w:t>payment</w:t>
-      </w:r>
-      <w:proofErr w:type="gramEnd"/>
-      <w:r>
-        <w:rPr>
-          <w:rFonts w:asciiTheme="majorHAnsi" w:hAnsiTheme="majorHAnsi" w:cs="Arial"/>
-          <w:color w:val="222222"/>
-          <w:sz w:val="22"/>
-          <w:szCs w:val="22"/>
-          <w:lang w:val="en-US"/>
-        </w:rPr>
-        <w:t>_schedule</w:t>
+        <w:t>payment_schedule</w:t>
       </w:r>
       <w:proofErr w:type="spellEnd"/>
       <w:r>
@@ -3694,7 +3420,6 @@
         </w:rPr>
       </w:pPr>
       <w:bookmarkStart w:id="8" w:name="_Hlk211507943"/>
-      <w:proofErr w:type="gramStart"/>
       <w:r>
         <w:rPr>
           <w:rFonts w:asciiTheme="majorHAnsi" w:hAnsiTheme="majorHAnsi"/>
@@ -3706,14 +3431,7 @@
         <w:rPr>
           <w:rFonts w:asciiTheme="majorHAnsi" w:hAnsiTheme="majorHAnsi"/>
         </w:rPr>
-        <w:t>delivery</w:t>
-      </w:r>
-      <w:proofErr w:type="gramEnd"/>
-      <w:r>
-        <w:rPr>
-          <w:rFonts w:asciiTheme="majorHAnsi" w:hAnsiTheme="majorHAnsi"/>
-        </w:rPr>
-        <w:t>_time_text</w:t>
+        <w:t>delivery_time_text</w:t>
       </w:r>
       <w:proofErr w:type="spellEnd"/>
       <w:r>
@@ -4573,7 +4291,7 @@
             </wp:anchor>
           </w:drawing>
         </mc:Choice>
-        <mc:Fallback xmlns:w16sdtfl="http://schemas.microsoft.com/office/word/2024/wordml/sdtformatlock" xmlns:w16du="http://schemas.microsoft.com/office/word/2023/wordml/word16du" xmlns:oel="http://schemas.microsoft.com/office/2019/extlst">
+        <mc:Fallback xmlns:oel="http://schemas.microsoft.com/office/2019/extlst" xmlns:w16du="http://schemas.microsoft.com/office/word/2023/wordml/word16du" xmlns:w16sdtfl="http://schemas.microsoft.com/office/word/2024/wordml/sdtformatlock">
           <w:pict>
             <v:line w14:anchorId="213FC00D" id="Conector recto 19" o:spid="_x0000_s1026" style="position:absolute;z-index:251661312;visibility:visible;mso-wrap-style:square;mso-width-percent:0;mso-height-percent:0;mso-wrap-distance-left:9pt;mso-wrap-distance-top:0;mso-wrap-distance-right:9pt;mso-wrap-distance-bottom:0;mso-position-horizontal:right;mso-position-horizontal-relative:margin;mso-position-vertical:absolute;mso-position-vertical-relative:text;mso-width-percent:0;mso-height-percent:0;mso-width-relative:margin;mso-height-relative:margin" from="389.05pt,8pt" to="829.3pt,8.75pt" o:gfxdata="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" strokecolor="#4b0000" strokeweight="1pt">
               <w10:wrap anchorx="margin"/>
@@ -5256,7 +4974,29 @@
                         <w:szCs w:val="24"/>
                         <w:lang w:val="es-MX"/>
                       </w:rPr>
-                      <w:t>Cl 79 Sur # 47E – 62 Of. 308-309</w:t>
+                      <w:t xml:space="preserve">Cl 79 Sur # 47E – 62 </w:t>
+                    </w:r>
+                    <w:proofErr w:type="spellStart"/>
+                    <w:r>
+                      <w:rPr>
+                        <w:rFonts w:ascii="Arial Narrow" w:hAnsi="Arial Narrow"/>
+                        <w:color w:val="FFFFFF" w:themeColor="background1"/>
+                        <w:sz w:val="24"/>
+                        <w:szCs w:val="24"/>
+                        <w:lang w:val="es-MX"/>
+                      </w:rPr>
+                      <w:t>Of</w:t>
+                    </w:r>
+                    <w:proofErr w:type="spellEnd"/>
+                    <w:r>
+                      <w:rPr>
+                        <w:rFonts w:ascii="Arial Narrow" w:hAnsi="Arial Narrow"/>
+                        <w:color w:val="FFFFFF" w:themeColor="background1"/>
+                        <w:sz w:val="24"/>
+                        <w:szCs w:val="24"/>
+                        <w:lang w:val="es-MX"/>
+                      </w:rPr>
+                      <w:t>. 308-309</w:t>
                     </w:r>
                   </w:p>
                   <w:p>

</xml_diff>